<commit_message>
Open v3.3 with Role and Task, as in the original prompt
The pasted prompt now begins with the original "Role and Task"
statement (senior instructional designer persona and task) immediately
after the scissors line, before the CRAFT sections, matching how v3.1
opened. R — Role keeps the responsibilities and the three-reader
commitment. Change log crosswalk updated.

Co-Authored-By: Claude Fable 5.1 <noreply@anthropic.com>
Claude-Session: https://claude.ai/code/session_01XQ5jkn9FtwdwXBGH4yqZ1C
</commit_message>
<xml_diff>
--- a/storyboard-prompt/CHANGELOG-v3.2.docx
+++ b/storyboard-prompt/CHANGELOG-v3.2.docx
@@ -7737,10 +7737,10 @@
         </w:tblBorders>
       </w:tblPr>
       <w:tblGrid>
-        <w:gridCol w:w="2259"/>
-        <w:gridCol w:w="3036"/>
-        <w:gridCol w:w="2380"/>
-        <w:gridCol w:w="2405"/>
+        <w:gridCol w:w="1849"/>
+        <w:gridCol w:w="4314"/>
+        <w:gridCol w:w="1948"/>
+        <w:gridCol w:w="1969"/>
       </w:tblGrid>
       <w:tr>
         <w:trPr>
@@ -7749,7 +7749,7 @@
         </w:trPr>
         <w:tc>
           <w:tcPr>
-            <w:tcW w:type="dxa" w:w="2259"/>
+            <w:tcW w:type="dxa" w:w="1849"/>
             <w:tcBorders>
               <w:top w:val="single" w:color="000000" w:sz="4"/>
               <w:left w:val="single" w:color="000000" w:sz="4"/>
@@ -7781,7 +7781,7 @@
         </w:tc>
         <w:tc>
           <w:tcPr>
-            <w:tcW w:type="dxa" w:w="3036"/>
+            <w:tcW w:type="dxa" w:w="4314"/>
             <w:tcBorders>
               <w:top w:val="single" w:color="000000" w:sz="4"/>
               <w:left w:val="single" w:color="000000" w:sz="4"/>
@@ -7813,7 +7813,7 @@
         </w:tc>
         <w:tc>
           <w:tcPr>
-            <w:tcW w:type="dxa" w:w="2380"/>
+            <w:tcW w:type="dxa" w:w="1948"/>
             <w:tcBorders>
               <w:top w:val="single" w:color="000000" w:sz="4"/>
               <w:left w:val="single" w:color="000000" w:sz="4"/>
@@ -7845,7 +7845,7 @@
         </w:tc>
         <w:tc>
           <w:tcPr>
-            <w:tcW w:type="dxa" w:w="2405"/>
+            <w:tcW w:type="dxa" w:w="1969"/>
             <w:tcBorders>
               <w:top w:val="single" w:color="000000" w:sz="4"/>
               <w:left w:val="single" w:color="000000" w:sz="4"/>
@@ -7883,7 +7883,7 @@
         </w:trPr>
         <w:tc>
           <w:tcPr>
-            <w:tcW w:type="dxa" w:w="2259"/>
+            <w:tcW w:type="dxa" w:w="1849"/>
             <w:tcBorders>
               <w:top w:val="single" w:color="000000" w:sz="4"/>
               <w:left w:val="single" w:color="000000" w:sz="4"/>
@@ -7914,38 +7914,38 @@
         </w:tc>
         <w:tc>
           <w:tcPr>
-            <w:tcW w:type="dxa" w:w="3036"/>
-            <w:tcBorders>
-              <w:top w:val="single" w:color="000000" w:sz="4"/>
-              <w:left w:val="single" w:color="000000" w:sz="4"/>
-              <w:bottom w:val="single" w:color="000000" w:sz="4"/>
-              <w:right w:val="single" w:color="000000" w:sz="4"/>
-            </w:tcBorders>
-            <w:tcMar>
-              <w:top w:type="dxa" w:w="60"/>
-              <w:left w:type="dxa" w:w="90"/>
-              <w:bottom w:type="dxa" w:w="60"/>
-              <w:right w:type="dxa" w:w="90"/>
-            </w:tcMar>
-          </w:tcPr>
-          <w:p>
-            <w:pPr>
-              <w:spacing w:after="0" w:before="0"/>
-            </w:pPr>
-            <w:r>
-              <w:rPr>
-                <w:b w:val="false"/>
-                <w:bCs w:val="false"/>
-                <w:sz w:val="19"/>
-                <w:szCs w:val="19"/>
-              </w:rPr>
-              <w:t xml:space="preserve">R — Role</w:t>
-            </w:r>
-          </w:p>
-        </w:tc>
-        <w:tc>
-          <w:tcPr>
-            <w:tcW w:type="dxa" w:w="2380"/>
+            <w:tcW w:type="dxa" w:w="4314"/>
+            <w:tcBorders>
+              <w:top w:val="single" w:color="000000" w:sz="4"/>
+              <w:left w:val="single" w:color="000000" w:sz="4"/>
+              <w:bottom w:val="single" w:color="000000" w:sz="4"/>
+              <w:right w:val="single" w:color="000000" w:sz="4"/>
+            </w:tcBorders>
+            <w:tcMar>
+              <w:top w:type="dxa" w:w="60"/>
+              <w:left w:type="dxa" w:w="90"/>
+              <w:bottom w:type="dxa" w:w="60"/>
+              <w:right w:type="dxa" w:w="90"/>
+            </w:tcMar>
+          </w:tcPr>
+          <w:p>
+            <w:pPr>
+              <w:spacing w:after="0" w:before="0"/>
+            </w:pPr>
+            <w:r>
+              <w:rPr>
+                <w:b w:val="false"/>
+                <w:bCs w:val="false"/>
+                <w:sz w:val="19"/>
+                <w:szCs w:val="19"/>
+              </w:rPr>
+              <w:t xml:space="preserve">Role and Task (first section after the scissors line, as in v3.1), with responsibilities in R — Role</w:t>
+            </w:r>
+          </w:p>
+        </w:tc>
+        <w:tc>
+          <w:tcPr>
+            <w:tcW w:type="dxa" w:w="1948"/>
             <w:tcBorders>
               <w:top w:val="single" w:color="000000" w:sz="4"/>
               <w:left w:val="single" w:color="000000" w:sz="4"/>
@@ -7976,7 +7976,7 @@
         </w:tc>
         <w:tc>
           <w:tcPr>
-            <w:tcW w:type="dxa" w:w="2405"/>
+            <w:tcW w:type="dxa" w:w="1969"/>
             <w:tcBorders>
               <w:top w:val="single" w:color="000000" w:sz="4"/>
               <w:left w:val="single" w:color="000000" w:sz="4"/>
@@ -8013,7 +8013,7 @@
         </w:trPr>
         <w:tc>
           <w:tcPr>
-            <w:tcW w:type="dxa" w:w="2259"/>
+            <w:tcW w:type="dxa" w:w="1849"/>
             <w:tcBorders>
               <w:top w:val="single" w:color="000000" w:sz="4"/>
               <w:left w:val="single" w:color="000000" w:sz="4"/>
@@ -8044,7 +8044,7 @@
         </w:tc>
         <w:tc>
           <w:tcPr>
-            <w:tcW w:type="dxa" w:w="3036"/>
+            <w:tcW w:type="dxa" w:w="4314"/>
             <w:tcBorders>
               <w:top w:val="single" w:color="000000" w:sz="4"/>
               <w:left w:val="single" w:color="000000" w:sz="4"/>
@@ -8075,7 +8075,7 @@
         </w:tc>
         <w:tc>
           <w:tcPr>
-            <w:tcW w:type="dxa" w:w="2380"/>
+            <w:tcW w:type="dxa" w:w="1948"/>
             <w:tcBorders>
               <w:top w:val="single" w:color="000000" w:sz="4"/>
               <w:left w:val="single" w:color="000000" w:sz="4"/>
@@ -8106,7 +8106,7 @@
         </w:tc>
         <w:tc>
           <w:tcPr>
-            <w:tcW w:type="dxa" w:w="2405"/>
+            <w:tcW w:type="dxa" w:w="1969"/>
             <w:tcBorders>
               <w:top w:val="single" w:color="000000" w:sz="4"/>
               <w:left w:val="single" w:color="000000" w:sz="4"/>
@@ -8143,7 +8143,7 @@
         </w:trPr>
         <w:tc>
           <w:tcPr>
-            <w:tcW w:type="dxa" w:w="2259"/>
+            <w:tcW w:type="dxa" w:w="1849"/>
             <w:tcBorders>
               <w:top w:val="single" w:color="000000" w:sz="4"/>
               <w:left w:val="single" w:color="000000" w:sz="4"/>
@@ -8174,7 +8174,7 @@
         </w:tc>
         <w:tc>
           <w:tcPr>
-            <w:tcW w:type="dxa" w:w="3036"/>
+            <w:tcW w:type="dxa" w:w="4314"/>
             <w:tcBorders>
               <w:top w:val="single" w:color="000000" w:sz="4"/>
               <w:left w:val="single" w:color="000000" w:sz="4"/>
@@ -8205,7 +8205,7 @@
         </w:tc>
         <w:tc>
           <w:tcPr>
-            <w:tcW w:type="dxa" w:w="2380"/>
+            <w:tcW w:type="dxa" w:w="1948"/>
             <w:tcBorders>
               <w:top w:val="single" w:color="000000" w:sz="4"/>
               <w:left w:val="single" w:color="000000" w:sz="4"/>
@@ -8236,7 +8236,7 @@
         </w:tc>
         <w:tc>
           <w:tcPr>
-            <w:tcW w:type="dxa" w:w="2405"/>
+            <w:tcW w:type="dxa" w:w="1969"/>
             <w:tcBorders>
               <w:top w:val="single" w:color="000000" w:sz="4"/>
               <w:left w:val="single" w:color="000000" w:sz="4"/>
@@ -8273,7 +8273,7 @@
         </w:trPr>
         <w:tc>
           <w:tcPr>
-            <w:tcW w:type="dxa" w:w="2259"/>
+            <w:tcW w:type="dxa" w:w="1849"/>
             <w:tcBorders>
               <w:top w:val="single" w:color="000000" w:sz="4"/>
               <w:left w:val="single" w:color="000000" w:sz="4"/>
@@ -8304,7 +8304,7 @@
         </w:tc>
         <w:tc>
           <w:tcPr>
-            <w:tcW w:type="dxa" w:w="3036"/>
+            <w:tcW w:type="dxa" w:w="4314"/>
             <w:tcBorders>
               <w:top w:val="single" w:color="000000" w:sz="4"/>
               <w:left w:val="single" w:color="000000" w:sz="4"/>
@@ -8335,7 +8335,7 @@
         </w:tc>
         <w:tc>
           <w:tcPr>
-            <w:tcW w:type="dxa" w:w="2380"/>
+            <w:tcW w:type="dxa" w:w="1948"/>
             <w:tcBorders>
               <w:top w:val="single" w:color="000000" w:sz="4"/>
               <w:left w:val="single" w:color="000000" w:sz="4"/>
@@ -8366,7 +8366,7 @@
         </w:tc>
         <w:tc>
           <w:tcPr>
-            <w:tcW w:type="dxa" w:w="2405"/>
+            <w:tcW w:type="dxa" w:w="1969"/>
             <w:tcBorders>
               <w:top w:val="single" w:color="000000" w:sz="4"/>
               <w:left w:val="single" w:color="000000" w:sz="4"/>
@@ -8403,7 +8403,7 @@
         </w:trPr>
         <w:tc>
           <w:tcPr>
-            <w:tcW w:type="dxa" w:w="2259"/>
+            <w:tcW w:type="dxa" w:w="1849"/>
             <w:tcBorders>
               <w:top w:val="single" w:color="000000" w:sz="4"/>
               <w:left w:val="single" w:color="000000" w:sz="4"/>
@@ -8434,7 +8434,7 @@
         </w:tc>
         <w:tc>
           <w:tcPr>
-            <w:tcW w:type="dxa" w:w="3036"/>
+            <w:tcW w:type="dxa" w:w="4314"/>
             <w:tcBorders>
               <w:top w:val="single" w:color="000000" w:sz="4"/>
               <w:left w:val="single" w:color="000000" w:sz="4"/>
@@ -8465,7 +8465,7 @@
         </w:tc>
         <w:tc>
           <w:tcPr>
-            <w:tcW w:type="dxa" w:w="2380"/>
+            <w:tcW w:type="dxa" w:w="1948"/>
             <w:tcBorders>
               <w:top w:val="single" w:color="000000" w:sz="4"/>
               <w:left w:val="single" w:color="000000" w:sz="4"/>
@@ -8496,7 +8496,7 @@
         </w:tc>
         <w:tc>
           <w:tcPr>
-            <w:tcW w:type="dxa" w:w="2405"/>
+            <w:tcW w:type="dxa" w:w="1969"/>
             <w:tcBorders>
               <w:top w:val="single" w:color="000000" w:sz="4"/>
               <w:left w:val="single" w:color="000000" w:sz="4"/>
@@ -8533,7 +8533,7 @@
         </w:trPr>
         <w:tc>
           <w:tcPr>
-            <w:tcW w:type="dxa" w:w="2259"/>
+            <w:tcW w:type="dxa" w:w="1849"/>
             <w:tcBorders>
               <w:top w:val="single" w:color="000000" w:sz="4"/>
               <w:left w:val="single" w:color="000000" w:sz="4"/>
@@ -8564,7 +8564,7 @@
         </w:tc>
         <w:tc>
           <w:tcPr>
-            <w:tcW w:type="dxa" w:w="3036"/>
+            <w:tcW w:type="dxa" w:w="4314"/>
             <w:tcBorders>
               <w:top w:val="single" w:color="000000" w:sz="4"/>
               <w:left w:val="single" w:color="000000" w:sz="4"/>
@@ -8595,7 +8595,7 @@
         </w:tc>
         <w:tc>
           <w:tcPr>
-            <w:tcW w:type="dxa" w:w="2380"/>
+            <w:tcW w:type="dxa" w:w="1948"/>
             <w:tcBorders>
               <w:top w:val="single" w:color="000000" w:sz="4"/>
               <w:left w:val="single" w:color="000000" w:sz="4"/>
@@ -8626,7 +8626,7 @@
         </w:tc>
         <w:tc>
           <w:tcPr>
-            <w:tcW w:type="dxa" w:w="2405"/>
+            <w:tcW w:type="dxa" w:w="1969"/>
             <w:tcBorders>
               <w:top w:val="single" w:color="000000" w:sz="4"/>
               <w:left w:val="single" w:color="000000" w:sz="4"/>
@@ -8663,7 +8663,7 @@
         </w:trPr>
         <w:tc>
           <w:tcPr>
-            <w:tcW w:type="dxa" w:w="2259"/>
+            <w:tcW w:type="dxa" w:w="1849"/>
             <w:tcBorders>
               <w:top w:val="single" w:color="000000" w:sz="4"/>
               <w:left w:val="single" w:color="000000" w:sz="4"/>
@@ -8694,7 +8694,7 @@
         </w:tc>
         <w:tc>
           <w:tcPr>
-            <w:tcW w:type="dxa" w:w="3036"/>
+            <w:tcW w:type="dxa" w:w="4314"/>
             <w:tcBorders>
               <w:top w:val="single" w:color="000000" w:sz="4"/>
               <w:left w:val="single" w:color="000000" w:sz="4"/>
@@ -8725,7 +8725,7 @@
         </w:tc>
         <w:tc>
           <w:tcPr>
-            <w:tcW w:type="dxa" w:w="2380"/>
+            <w:tcW w:type="dxa" w:w="1948"/>
             <w:tcBorders>
               <w:top w:val="single" w:color="000000" w:sz="4"/>
               <w:left w:val="single" w:color="000000" w:sz="4"/>
@@ -8756,7 +8756,7 @@
         </w:tc>
         <w:tc>
           <w:tcPr>
-            <w:tcW w:type="dxa" w:w="2405"/>
+            <w:tcW w:type="dxa" w:w="1969"/>
             <w:tcBorders>
               <w:top w:val="single" w:color="000000" w:sz="4"/>
               <w:left w:val="single" w:color="000000" w:sz="4"/>
@@ -8793,7 +8793,7 @@
         </w:trPr>
         <w:tc>
           <w:tcPr>
-            <w:tcW w:type="dxa" w:w="2259"/>
+            <w:tcW w:type="dxa" w:w="1849"/>
             <w:tcBorders>
               <w:top w:val="single" w:color="000000" w:sz="4"/>
               <w:left w:val="single" w:color="000000" w:sz="4"/>
@@ -8824,7 +8824,7 @@
         </w:tc>
         <w:tc>
           <w:tcPr>
-            <w:tcW w:type="dxa" w:w="3036"/>
+            <w:tcW w:type="dxa" w:w="4314"/>
             <w:tcBorders>
               <w:top w:val="single" w:color="000000" w:sz="4"/>
               <w:left w:val="single" w:color="000000" w:sz="4"/>
@@ -8855,7 +8855,7 @@
         </w:tc>
         <w:tc>
           <w:tcPr>
-            <w:tcW w:type="dxa" w:w="2380"/>
+            <w:tcW w:type="dxa" w:w="1948"/>
             <w:tcBorders>
               <w:top w:val="single" w:color="000000" w:sz="4"/>
               <w:left w:val="single" w:color="000000" w:sz="4"/>
@@ -8886,7 +8886,7 @@
         </w:tc>
         <w:tc>
           <w:tcPr>
-            <w:tcW w:type="dxa" w:w="2405"/>
+            <w:tcW w:type="dxa" w:w="1969"/>
             <w:tcBorders>
               <w:top w:val="single" w:color="000000" w:sz="4"/>
               <w:left w:val="single" w:color="000000" w:sz="4"/>
@@ -8923,7 +8923,7 @@
         </w:trPr>
         <w:tc>
           <w:tcPr>
-            <w:tcW w:type="dxa" w:w="2259"/>
+            <w:tcW w:type="dxa" w:w="1849"/>
             <w:tcBorders>
               <w:top w:val="single" w:color="000000" w:sz="4"/>
               <w:left w:val="single" w:color="000000" w:sz="4"/>
@@ -8954,7 +8954,7 @@
         </w:tc>
         <w:tc>
           <w:tcPr>
-            <w:tcW w:type="dxa" w:w="3036"/>
+            <w:tcW w:type="dxa" w:w="4314"/>
             <w:tcBorders>
               <w:top w:val="single" w:color="000000" w:sz="4"/>
               <w:left w:val="single" w:color="000000" w:sz="4"/>
@@ -8985,7 +8985,7 @@
         </w:tc>
         <w:tc>
           <w:tcPr>
-            <w:tcW w:type="dxa" w:w="2380"/>
+            <w:tcW w:type="dxa" w:w="1948"/>
             <w:tcBorders>
               <w:top w:val="single" w:color="000000" w:sz="4"/>
               <w:left w:val="single" w:color="000000" w:sz="4"/>
@@ -9016,7 +9016,7 @@
         </w:tc>
         <w:tc>
           <w:tcPr>
-            <w:tcW w:type="dxa" w:w="2405"/>
+            <w:tcW w:type="dxa" w:w="1969"/>
             <w:tcBorders>
               <w:top w:val="single" w:color="000000" w:sz="4"/>
               <w:left w:val="single" w:color="000000" w:sz="4"/>
@@ -9053,7 +9053,7 @@
         </w:trPr>
         <w:tc>
           <w:tcPr>
-            <w:tcW w:type="dxa" w:w="2259"/>
+            <w:tcW w:type="dxa" w:w="1849"/>
             <w:tcBorders>
               <w:top w:val="single" w:color="000000" w:sz="4"/>
               <w:left w:val="single" w:color="000000" w:sz="4"/>
@@ -9084,7 +9084,7 @@
         </w:tc>
         <w:tc>
           <w:tcPr>
-            <w:tcW w:type="dxa" w:w="3036"/>
+            <w:tcW w:type="dxa" w:w="4314"/>
             <w:tcBorders>
               <w:top w:val="single" w:color="000000" w:sz="4"/>
               <w:left w:val="single" w:color="000000" w:sz="4"/>
@@ -9115,7 +9115,7 @@
         </w:tc>
         <w:tc>
           <w:tcPr>
-            <w:tcW w:type="dxa" w:w="2380"/>
+            <w:tcW w:type="dxa" w:w="1948"/>
             <w:tcBorders>
               <w:top w:val="single" w:color="000000" w:sz="4"/>
               <w:left w:val="single" w:color="000000" w:sz="4"/>
@@ -9146,7 +9146,7 @@
         </w:tc>
         <w:tc>
           <w:tcPr>
-            <w:tcW w:type="dxa" w:w="2405"/>
+            <w:tcW w:type="dxa" w:w="1969"/>
             <w:tcBorders>
               <w:top w:val="single" w:color="000000" w:sz="4"/>
               <w:left w:val="single" w:color="000000" w:sz="4"/>
@@ -9183,7 +9183,7 @@
         </w:trPr>
         <w:tc>
           <w:tcPr>
-            <w:tcW w:type="dxa" w:w="2259"/>
+            <w:tcW w:type="dxa" w:w="1849"/>
             <w:tcBorders>
               <w:top w:val="single" w:color="000000" w:sz="4"/>
               <w:left w:val="single" w:color="000000" w:sz="4"/>
@@ -9214,7 +9214,7 @@
         </w:tc>
         <w:tc>
           <w:tcPr>
-            <w:tcW w:type="dxa" w:w="3036"/>
+            <w:tcW w:type="dxa" w:w="4314"/>
             <w:tcBorders>
               <w:top w:val="single" w:color="000000" w:sz="4"/>
               <w:left w:val="single" w:color="000000" w:sz="4"/>
@@ -9245,7 +9245,7 @@
         </w:tc>
         <w:tc>
           <w:tcPr>
-            <w:tcW w:type="dxa" w:w="2380"/>
+            <w:tcW w:type="dxa" w:w="1948"/>
             <w:tcBorders>
               <w:top w:val="single" w:color="000000" w:sz="4"/>
               <w:left w:val="single" w:color="000000" w:sz="4"/>
@@ -9276,7 +9276,7 @@
         </w:tc>
         <w:tc>
           <w:tcPr>
-            <w:tcW w:type="dxa" w:w="2405"/>
+            <w:tcW w:type="dxa" w:w="1969"/>
             <w:tcBorders>
               <w:top w:val="single" w:color="000000" w:sz="4"/>
               <w:left w:val="single" w:color="000000" w:sz="4"/>

</xml_diff>

<commit_message>
Restore v3.1 items found by the completeness audit of v3.3
A line-by-line comparison of v3.1 against v3.3 found no lost rule but
four items not carried as named features: the Step 3 adapted project
prompt (restored as an export-on-request artifact), the modelled-on
slide field from the Chunking Map, the target/criterion, required
evidence, and feedback approach fields from the Assessment and
Interaction maps, and the build notes, interaction logic, and feedback
logic fields from the internal notes. All are now in the Slide
Planning Row or the artifact table. The change log records the audit
and the items deliberately not carried.

Co-Authored-By: Claude Fable 5.1 <noreply@anthropic.com>
Claude-Session: https://claude.ai/code/session_01XQ5jkn9FtwdwXBGH4yqZ1C
</commit_message>
<xml_diff>
--- a/storyboard-prompt/CHANGELOG-v3.2.docx
+++ b/storyboard-prompt/CHANGELOG-v3.2.docx
@@ -11178,7 +11178,553 @@
         <w:spacing w:after="100"/>
       </w:pPr>
       <w:r>
-        <w:t xml:space="preserve">v3.2 about 15,900 words; v3.3 about 17,900 words. The additions are the rules above and the two context blocks; nothing was removed.</w:t>
+        <w:t xml:space="preserve">v3.2 about 15,900 words; v3.3 about 18,000 words. The additions are the rules above and the two context blocks; nothing was removed.</w:t>
+      </w:r>
+    </w:p>
+    <w:p>
+      <w:pPr>
+        <w:pStyle w:val="Heading2"/>
+        <w:keepNext/>
+      </w:pPr>
+      <w:r>
+        <w:t xml:space="preserve">v3.3 completeness audit against v3.1</w:t>
+      </w:r>
+    </w:p>
+    <w:p>
+      <w:pPr>
+        <w:spacing w:after="100"/>
+      </w:pPr>
+      <w:r>
+        <w:t xml:space="preserve">A line-by-line comparison of the original v3.1 against v3.3 (413 distinctive terms, quoted strings, markers, numbers, and field names, plus a content-word coverage score for all 592 substantive lines) found no lost rule. It found these items, which were then restored:</w:t>
+      </w:r>
+    </w:p>
+    <w:tbl>
+      <w:tblPr>
+        <w:tblW w:type="dxa" w:w="10080"/>
+        <w:tblBorders>
+          <w:top w:val="single" w:color="auto" w:sz="4"/>
+          <w:left w:val="single" w:color="auto" w:sz="4"/>
+          <w:bottom w:val="single" w:color="auto" w:sz="4"/>
+          <w:right w:val="single" w:color="auto" w:sz="4"/>
+          <w:insideH w:val="single" w:color="auto" w:sz="4"/>
+          <w:insideV w:val="single" w:color="auto" w:sz="4"/>
+        </w:tblBorders>
+      </w:tblPr>
+      <w:tblGrid>
+        <w:gridCol w:w="5754"/>
+        <w:gridCol w:w="2641"/>
+        <w:gridCol w:w="1685"/>
+      </w:tblGrid>
+      <w:tr>
+        <w:trPr>
+          <w:cantSplit w:val="false"/>
+          <w:tblHeader/>
+        </w:trPr>
+        <w:tc>
+          <w:tcPr>
+            <w:tcW w:type="dxa" w:w="5754"/>
+            <w:tcBorders>
+              <w:top w:val="single" w:color="000000" w:sz="4"/>
+              <w:left w:val="single" w:color="000000" w:sz="4"/>
+              <w:bottom w:val="single" w:color="000000" w:sz="4"/>
+              <w:right w:val="single" w:color="000000" w:sz="4"/>
+            </w:tcBorders>
+            <w:shd w:fill="E7E6E6" w:color="auto" w:val="clear"/>
+            <w:tcMar>
+              <w:top w:type="dxa" w:w="60"/>
+              <w:left w:type="dxa" w:w="90"/>
+              <w:bottom w:type="dxa" w:w="60"/>
+              <w:right w:type="dxa" w:w="90"/>
+            </w:tcMar>
+          </w:tcPr>
+          <w:p>
+            <w:pPr>
+              <w:spacing w:after="0" w:before="0"/>
+            </w:pPr>
+            <w:r>
+              <w:rPr>
+                <w:b/>
+                <w:bCs/>
+                <w:sz w:val="19"/>
+                <w:szCs w:val="19"/>
+              </w:rPr>
+              <w:t xml:space="preserve">Item from v3.1</w:t>
+            </w:r>
+          </w:p>
+        </w:tc>
+        <w:tc>
+          <w:tcPr>
+            <w:tcW w:type="dxa" w:w="2641"/>
+            <w:tcBorders>
+              <w:top w:val="single" w:color="000000" w:sz="4"/>
+              <w:left w:val="single" w:color="000000" w:sz="4"/>
+              <w:bottom w:val="single" w:color="000000" w:sz="4"/>
+              <w:right w:val="single" w:color="000000" w:sz="4"/>
+            </w:tcBorders>
+            <w:shd w:fill="E7E6E6" w:color="auto" w:val="clear"/>
+            <w:tcMar>
+              <w:top w:type="dxa" w:w="60"/>
+              <w:left w:type="dxa" w:w="90"/>
+              <w:bottom w:type="dxa" w:w="60"/>
+              <w:right w:type="dxa" w:w="90"/>
+            </w:tcMar>
+          </w:tcPr>
+          <w:p>
+            <w:pPr>
+              <w:spacing w:after="0" w:before="0"/>
+            </w:pPr>
+            <w:r>
+              <w:rPr>
+                <w:b/>
+                <w:bCs/>
+                <w:sz w:val="19"/>
+                <w:szCs w:val="19"/>
+              </w:rPr>
+              <w:t xml:space="preserve">Status before the audit</w:t>
+            </w:r>
+          </w:p>
+        </w:tc>
+        <w:tc>
+          <w:tcPr>
+            <w:tcW w:type="dxa" w:w="1685"/>
+            <w:tcBorders>
+              <w:top w:val="single" w:color="000000" w:sz="4"/>
+              <w:left w:val="single" w:color="000000" w:sz="4"/>
+              <w:bottom w:val="single" w:color="000000" w:sz="4"/>
+              <w:right w:val="single" w:color="000000" w:sz="4"/>
+            </w:tcBorders>
+            <w:shd w:fill="E7E6E6" w:color="auto" w:val="clear"/>
+            <w:tcMar>
+              <w:top w:type="dxa" w:w="60"/>
+              <w:left w:type="dxa" w:w="90"/>
+              <w:bottom w:type="dxa" w:w="60"/>
+              <w:right w:type="dxa" w:w="90"/>
+            </w:tcMar>
+          </w:tcPr>
+          <w:p>
+            <w:pPr>
+              <w:spacing w:after="0" w:before="0"/>
+            </w:pPr>
+            <w:r>
+              <w:rPr>
+                <w:b/>
+                <w:bCs/>
+                <w:sz w:val="19"/>
+                <w:szCs w:val="19"/>
+              </w:rPr>
+              <w:t xml:space="preserve">Restored in</w:t>
+            </w:r>
+          </w:p>
+        </w:tc>
+      </w:tr>
+      <w:tr>
+        <w:trPr>
+          <w:cantSplit w:val="false"/>
+          <w:tblHeader w:val="false"/>
+        </w:trPr>
+        <w:tc>
+          <w:tcPr>
+            <w:tcW w:type="dxa" w:w="5754"/>
+            <w:tcBorders>
+              <w:top w:val="single" w:color="000000" w:sz="4"/>
+              <w:left w:val="single" w:color="000000" w:sz="4"/>
+              <w:bottom w:val="single" w:color="000000" w:sz="4"/>
+              <w:right w:val="single" w:color="000000" w:sz="4"/>
+            </w:tcBorders>
+            <w:tcMar>
+              <w:top w:type="dxa" w:w="60"/>
+              <w:left w:type="dxa" w:w="90"/>
+              <w:bottom w:type="dxa" w:w="60"/>
+              <w:right w:type="dxa" w:w="90"/>
+            </w:tcMar>
+          </w:tcPr>
+          <w:p>
+            <w:pPr>
+              <w:spacing w:after="0" w:before="0"/>
+            </w:pPr>
+            <w:r>
+              <w:rPr>
+                <w:b w:val="false"/>
+                <w:bCs w:val="false"/>
+                <w:sz w:val="19"/>
+                <w:szCs w:val="19"/>
+              </w:rPr>
+              <w:t xml:space="preserve">Step 3 "Adapted Project Storyboard Master Prompt": a copy-ready project prompt adapted to the new project</w:t>
+            </w:r>
+          </w:p>
+        </w:tc>
+        <w:tc>
+          <w:tcPr>
+            <w:tcW w:type="dxa" w:w="2641"/>
+            <w:tcBorders>
+              <w:top w:val="single" w:color="000000" w:sz="4"/>
+              <w:left w:val="single" w:color="000000" w:sz="4"/>
+              <w:bottom w:val="single" w:color="000000" w:sz="4"/>
+              <w:right w:val="single" w:color="000000" w:sz="4"/>
+            </w:tcBorders>
+            <w:tcMar>
+              <w:top w:type="dxa" w:w="60"/>
+              <w:left w:type="dxa" w:w="90"/>
+              <w:bottom w:type="dxa" w:w="60"/>
+              <w:right w:type="dxa" w:w="90"/>
+            </w:tcMar>
+          </w:tcPr>
+          <w:p>
+            <w:pPr>
+              <w:spacing w:after="0" w:before="0"/>
+            </w:pPr>
+            <w:r>
+              <w:rPr>
+                <w:b w:val="false"/>
+                <w:bCs w:val="false"/>
+                <w:sz w:val="19"/>
+                <w:szCs w:val="19"/>
+              </w:rPr>
+              <w:t xml:space="preserve">Removed as dead framing (it wrapped sections A to S)</w:t>
+            </w:r>
+          </w:p>
+        </w:tc>
+        <w:tc>
+          <w:tcPr>
+            <w:tcW w:type="dxa" w:w="1685"/>
+            <w:tcBorders>
+              <w:top w:val="single" w:color="000000" w:sz="4"/>
+              <w:left w:val="single" w:color="000000" w:sz="4"/>
+              <w:bottom w:val="single" w:color="000000" w:sz="4"/>
+              <w:right w:val="single" w:color="000000" w:sz="4"/>
+            </w:tcBorders>
+            <w:tcMar>
+              <w:top w:type="dxa" w:w="60"/>
+              <w:left w:type="dxa" w:w="90"/>
+              <w:bottom w:type="dxa" w:w="60"/>
+              <w:right w:type="dxa" w:w="90"/>
+            </w:tcMar>
+          </w:tcPr>
+          <w:p>
+            <w:pPr>
+              <w:spacing w:after="0" w:before="0"/>
+            </w:pPr>
+            <w:r>
+              <w:rPr>
+                <w:b w:val="false"/>
+                <w:bCs w:val="false"/>
+                <w:sz w:val="19"/>
+                <w:szCs w:val="19"/>
+              </w:rPr>
+              <w:t xml:space="preserve">C2.3 artifact table as an export-on-request artifact; A1.5 names it as Step 3</w:t>
+            </w:r>
+          </w:p>
+        </w:tc>
+      </w:tr>
+      <w:tr>
+        <w:trPr>
+          <w:cantSplit w:val="false"/>
+          <w:tblHeader w:val="false"/>
+        </w:trPr>
+        <w:tc>
+          <w:tcPr>
+            <w:tcW w:type="dxa" w:w="5754"/>
+            <w:tcBorders>
+              <w:top w:val="single" w:color="000000" w:sz="4"/>
+              <w:left w:val="single" w:color="000000" w:sz="4"/>
+              <w:bottom w:val="single" w:color="000000" w:sz="4"/>
+              <w:right w:val="single" w:color="000000" w:sz="4"/>
+            </w:tcBorders>
+            <w:tcMar>
+              <w:top w:type="dxa" w:w="60"/>
+              <w:left w:type="dxa" w:w="90"/>
+              <w:bottom w:type="dxa" w:w="60"/>
+              <w:right w:type="dxa" w:w="90"/>
+            </w:tcMar>
+          </w:tcPr>
+          <w:p>
+            <w:pPr>
+              <w:spacing w:after="0" w:before="0"/>
+            </w:pPr>
+            <w:r>
+              <w:rPr>
+                <w:b w:val="false"/>
+                <w:bCs w:val="false"/>
+                <w:sz w:val="19"/>
+                <w:szCs w:val="19"/>
+              </w:rPr>
+              <w:t xml:space="preserve">Chunking Map field "Worked example/model slide(s)"</w:t>
+            </w:r>
+          </w:p>
+        </w:tc>
+        <w:tc>
+          <w:tcPr>
+            <w:tcW w:type="dxa" w:w="2641"/>
+            <w:tcBorders>
+              <w:top w:val="single" w:color="000000" w:sz="4"/>
+              <w:left w:val="single" w:color="000000" w:sz="4"/>
+              <w:bottom w:val="single" w:color="000000" w:sz="4"/>
+              <w:right w:val="single" w:color="000000" w:sz="4"/>
+            </w:tcBorders>
+            <w:tcMar>
+              <w:top w:type="dxa" w:w="60"/>
+              <w:left w:type="dxa" w:w="90"/>
+              <w:bottom w:type="dxa" w:w="60"/>
+              <w:right w:type="dxa" w:w="90"/>
+            </w:tcMar>
+          </w:tcPr>
+          <w:p>
+            <w:pPr>
+              <w:spacing w:after="0" w:before="0"/>
+            </w:pPr>
+            <w:r>
+              <w:rPr>
+                <w:b w:val="false"/>
+                <w:bCs w:val="false"/>
+                <w:sz w:val="19"/>
+                <w:szCs w:val="19"/>
+              </w:rPr>
+              <w:t xml:space="preserve">Present only in the Objective Coverage Map (Appendix B2)</w:t>
+            </w:r>
+          </w:p>
+        </w:tc>
+        <w:tc>
+          <w:tcPr>
+            <w:tcW w:type="dxa" w:w="1685"/>
+            <w:tcBorders>
+              <w:top w:val="single" w:color="000000" w:sz="4"/>
+              <w:left w:val="single" w:color="000000" w:sz="4"/>
+              <w:bottom w:val="single" w:color="000000" w:sz="4"/>
+              <w:right w:val="single" w:color="000000" w:sz="4"/>
+            </w:tcBorders>
+            <w:tcMar>
+              <w:top w:type="dxa" w:w="60"/>
+              <w:left w:type="dxa" w:w="90"/>
+              <w:bottom w:type="dxa" w:w="60"/>
+              <w:right w:type="dxa" w:w="90"/>
+            </w:tcMar>
+          </w:tcPr>
+          <w:p>
+            <w:pPr>
+              <w:spacing w:after="0" w:before="0"/>
+            </w:pPr>
+            <w:r>
+              <w:rPr>
+                <w:b w:val="false"/>
+                <w:bCs w:val="false"/>
+                <w:sz w:val="19"/>
+                <w:szCs w:val="19"/>
+              </w:rPr>
+              <w:t xml:space="preserve">Appendix C</w:t>
+            </w:r>
+          </w:p>
+        </w:tc>
+      </w:tr>
+      <w:tr>
+        <w:trPr>
+          <w:cantSplit w:val="false"/>
+          <w:tblHeader w:val="false"/>
+        </w:trPr>
+        <w:tc>
+          <w:tcPr>
+            <w:tcW w:type="dxa" w:w="5754"/>
+            <w:tcBorders>
+              <w:top w:val="single" w:color="000000" w:sz="4"/>
+              <w:left w:val="single" w:color="000000" w:sz="4"/>
+              <w:bottom w:val="single" w:color="000000" w:sz="4"/>
+              <w:right w:val="single" w:color="000000" w:sz="4"/>
+            </w:tcBorders>
+            <w:tcMar>
+              <w:top w:type="dxa" w:w="60"/>
+              <w:left w:type="dxa" w:w="90"/>
+              <w:bottom w:type="dxa" w:w="60"/>
+              <w:right w:type="dxa" w:w="90"/>
+            </w:tcMar>
+          </w:tcPr>
+          <w:p>
+            <w:pPr>
+              <w:spacing w:after="0" w:before="0"/>
+            </w:pPr>
+            <w:r>
+              <w:rPr>
+                <w:b w:val="false"/>
+                <w:bCs w:val="false"/>
+                <w:sz w:val="19"/>
+                <w:szCs w:val="19"/>
+              </w:rPr>
+              <w:t xml:space="preserve">Assessment Map fields "Target or criterion", "Required evidence", "Required feedback"; Interaction and Assessment Map field "Feedback approach"</w:t>
+            </w:r>
+          </w:p>
+        </w:tc>
+        <w:tc>
+          <w:tcPr>
+            <w:tcW w:type="dxa" w:w="2641"/>
+            <w:tcBorders>
+              <w:top w:val="single" w:color="000000" w:sz="4"/>
+              <w:left w:val="single" w:color="000000" w:sz="4"/>
+              <w:bottom w:val="single" w:color="000000" w:sz="4"/>
+              <w:right w:val="single" w:color="000000" w:sz="4"/>
+            </w:tcBorders>
+            <w:tcMar>
+              <w:top w:type="dxa" w:w="60"/>
+              <w:left w:type="dxa" w:w="90"/>
+              <w:bottom w:type="dxa" w:w="60"/>
+              <w:right w:type="dxa" w:w="90"/>
+            </w:tcMar>
+          </w:tcPr>
+          <w:p>
+            <w:pPr>
+              <w:spacing w:after="0" w:before="0"/>
+            </w:pPr>
+            <w:r>
+              <w:rPr>
+                <w:b w:val="false"/>
+                <w:bCs w:val="false"/>
+                <w:sz w:val="19"/>
+                <w:szCs w:val="19"/>
+              </w:rPr>
+              <w:t xml:space="preserve">Not carried as named fields</w:t>
+            </w:r>
+          </w:p>
+        </w:tc>
+        <w:tc>
+          <w:tcPr>
+            <w:tcW w:type="dxa" w:w="1685"/>
+            <w:tcBorders>
+              <w:top w:val="single" w:color="000000" w:sz="4"/>
+              <w:left w:val="single" w:color="000000" w:sz="4"/>
+              <w:bottom w:val="single" w:color="000000" w:sz="4"/>
+              <w:right w:val="single" w:color="000000" w:sz="4"/>
+            </w:tcBorders>
+            <w:tcMar>
+              <w:top w:type="dxa" w:w="60"/>
+              <w:left w:type="dxa" w:w="90"/>
+              <w:bottom w:type="dxa" w:w="60"/>
+              <w:right w:type="dxa" w:w="90"/>
+            </w:tcMar>
+          </w:tcPr>
+          <w:p>
+            <w:pPr>
+              <w:spacing w:after="0" w:before="0"/>
+            </w:pPr>
+            <w:r>
+              <w:rPr>
+                <w:b w:val="false"/>
+                <w:bCs w:val="false"/>
+                <w:sz w:val="19"/>
+                <w:szCs w:val="19"/>
+              </w:rPr>
+              <w:t xml:space="preserve">Appendix C</w:t>
+            </w:r>
+          </w:p>
+        </w:tc>
+      </w:tr>
+      <w:tr>
+        <w:trPr>
+          <w:cantSplit w:val="false"/>
+          <w:tblHeader w:val="false"/>
+        </w:trPr>
+        <w:tc>
+          <w:tcPr>
+            <w:tcW w:type="dxa" w:w="5754"/>
+            <w:tcBorders>
+              <w:top w:val="single" w:color="000000" w:sz="4"/>
+              <w:left w:val="single" w:color="000000" w:sz="4"/>
+              <w:bottom w:val="single" w:color="000000" w:sz="4"/>
+              <w:right w:val="single" w:color="000000" w:sz="4"/>
+            </w:tcBorders>
+            <w:tcMar>
+              <w:top w:type="dxa" w:w="60"/>
+              <w:left w:type="dxa" w:w="90"/>
+              <w:bottom w:type="dxa" w:w="60"/>
+              <w:right w:type="dxa" w:w="90"/>
+            </w:tcMar>
+          </w:tcPr>
+          <w:p>
+            <w:pPr>
+              <w:spacing w:after="0" w:before="0"/>
+            </w:pPr>
+            <w:r>
+              <w:rPr>
+                <w:b w:val="false"/>
+                <w:bCs w:val="false"/>
+                <w:sz w:val="19"/>
+                <w:szCs w:val="19"/>
+              </w:rPr>
+              <w:t xml:space="preserve">Internal notes fields "Build / implementation notes", "Interaction logic", "Feedback logic"</w:t>
+            </w:r>
+          </w:p>
+        </w:tc>
+        <w:tc>
+          <w:tcPr>
+            <w:tcW w:type="dxa" w:w="2641"/>
+            <w:tcBorders>
+              <w:top w:val="single" w:color="000000" w:sz="4"/>
+              <w:left w:val="single" w:color="000000" w:sz="4"/>
+              <w:bottom w:val="single" w:color="000000" w:sz="4"/>
+              <w:right w:val="single" w:color="000000" w:sz="4"/>
+            </w:tcBorders>
+            <w:tcMar>
+              <w:top w:type="dxa" w:w="60"/>
+              <w:left w:type="dxa" w:w="90"/>
+              <w:bottom w:type="dxa" w:w="60"/>
+              <w:right w:type="dxa" w:w="90"/>
+            </w:tcMar>
+          </w:tcPr>
+          <w:p>
+            <w:pPr>
+              <w:spacing w:after="0" w:before="0"/>
+            </w:pPr>
+            <w:r>
+              <w:rPr>
+                <w:b w:val="false"/>
+                <w:bCs w:val="false"/>
+                <w:sz w:val="19"/>
+                <w:szCs w:val="19"/>
+              </w:rPr>
+              <w:t xml:space="preserve">Not carried as named fields</w:t>
+            </w:r>
+          </w:p>
+        </w:tc>
+        <w:tc>
+          <w:tcPr>
+            <w:tcW w:type="dxa" w:w="1685"/>
+            <w:tcBorders>
+              <w:top w:val="single" w:color="000000" w:sz="4"/>
+              <w:left w:val="single" w:color="000000" w:sz="4"/>
+              <w:bottom w:val="single" w:color="000000" w:sz="4"/>
+              <w:right w:val="single" w:color="000000" w:sz="4"/>
+            </w:tcBorders>
+            <w:tcMar>
+              <w:top w:type="dxa" w:w="60"/>
+              <w:left w:type="dxa" w:w="90"/>
+              <w:bottom w:type="dxa" w:w="60"/>
+              <w:right w:type="dxa" w:w="90"/>
+            </w:tcMar>
+          </w:tcPr>
+          <w:p>
+            <w:pPr>
+              <w:spacing w:after="0" w:before="0"/>
+            </w:pPr>
+            <w:r>
+              <w:rPr>
+                <w:b w:val="false"/>
+                <w:bCs w:val="false"/>
+                <w:sz w:val="19"/>
+                <w:szCs w:val="19"/>
+              </w:rPr>
+              <w:t xml:space="preserve">Appendix C</w:t>
+            </w:r>
+          </w:p>
+        </w:tc>
+      </w:tr>
+    </w:tbl>
+    <w:p>
+      <w:pPr>
+        <w:spacing w:after="120" w:before="0"/>
+      </w:pPr>
+    </w:p>
+    <w:p>
+      <w:pPr>
+        <w:spacing w:after="100"/>
+      </w:pPr>
+      <w:r>
+        <w:t xml:space="preserve">Deliberately not carried, by decision: Notes for Maintaining the Generator (section 5 of this file), Appendix 12 (replaced by the C2.3 table), Appendix 14 (its resolutions are now the rules), Layer 2 section 1 (release notes), Layer 2 section 29 (integration instructions), the Public Affairs example in Appendix 10 (replaced by a neutral example), the two alternative wordings of the "confirm component" marker (one marker), and the three-mode Interaction model (replaced by five modes).</w:t>
       </w:r>
     </w:p>
     <w:sectPr>

</xml_diff>